<commit_message>
Correct branch router port mapping in guide
</commit_message>
<xml_diff>
--- a/project-02-three-offices/guide.docx
+++ b/project-02-three-offices/guide.docx
@@ -793,7 +793,7 @@
               <w:rPr>
                 <w:sz w:val="17"/>
               </w:rPr>
-              <w:t>B2 G0/2 10.255.13.2</w:t>
+              <w:t>B2 G0/1 10.255.13.2</w:t>
             </w:r>
           </w:p>
         </w:tc>
@@ -863,7 +863,7 @@
               <w:rPr>
                 <w:sz w:val="17"/>
               </w:rPr>
-              <w:t>B2 G0/1 10.255.23.2</w:t>
+              <w:t>B2 G0/2 10.255.23.2</w:t>
             </w:r>
           </w:p>
         </w:tc>
@@ -1107,7 +1107,7 @@
               <w:rPr>
                 <w:sz w:val="17"/>
               </w:rPr>
-              <w:t>R-B2 G0/2</w:t>
+              <w:t>R-B2 G0/1</w:t>
             </w:r>
           </w:p>
         </w:tc>
@@ -1157,7 +1157,7 @@
               <w:rPr>
                 <w:sz w:val="17"/>
               </w:rPr>
-              <w:t>R-B2 G0/1</w:t>
+              <w:t>R-B2 G0/2</w:t>
             </w:r>
           </w:p>
         </w:tc>

</xml_diff>